<commit_message>
Updating documentation to reflect removal of hm cut command
</commit_message>
<xml_diff>
--- a/history_matching/documentation/history_matching_beginner_documentation.docx
+++ b/history_matching/documentation/history_matching_beginner_documentation.docx
@@ -1265,10 +1265,12 @@
         <w:rPr/>
         <w:t xml:space="preserve"> (</w:t>
       </w:r>
+      <w:proofErr w:type="spellStart"/>
       <w:r>
         <w:rPr/>
         <w:t>hm</w:t>
       </w:r>
+      <w:proofErr w:type="spellEnd"/>
       <w:r>
         <w:rPr/>
         <w:t xml:space="preserve"> sample </w:t>
@@ -1289,7 +1291,39 @@
       </w:r>
       <w:r>
         <w:rPr/>
-        <w:t>0), samples will be created by LHS. Otherwise, they are set as the prior iteration's candidate points.</w:t>
+        <w:t xml:space="preserve">0), samples will be created by LHS. Otherwise, they are </w:t>
+      </w:r>
+      <w:r>
+        <w:rPr/>
+        <w:t xml:space="preserve">chosen from the </w:t>
+      </w:r>
+      <w:r>
+        <w:rPr/>
+        <w:t xml:space="preserve">non-implausible parameter space defined by all prior iterations and </w:t>
+      </w:r>
+      <w:r>
+        <w:rPr/>
+        <w:t>their</w:t>
+      </w:r>
+      <w:r>
+        <w:rPr/>
+        <w:t xml:space="preserve"> C</w:t>
+      </w:r>
+      <w:r>
+        <w:rPr/>
+        <w:t xml:space="preserve">ut/ directories. In either case, the </w:t>
+      </w:r>
+      <w:r>
+        <w:rPr/>
+        <w:t>'</w:t>
+      </w:r>
+      <w:r>
+        <w:rPr/>
+        <w:t xml:space="preserve">-n </w:t>
+      </w:r>
+      <w:r>
+        <w:rPr/>
+        <w:t>N_SAMPLES' argument determines how may sample points to generate.</w:t>
       </w:r>
     </w:p>
     <w:p>
@@ -1493,7 +1527,19 @@
       </w:pPr>
       <w:r>
         <w:rPr/>
-        <w:t>In the following example, samples</w:t>
+        <w:t xml:space="preserve">In the following example, </w:t>
+      </w:r>
+      <w:r>
+        <w:rPr/>
+        <w:t xml:space="preserve">1000 </w:t>
+      </w:r>
+      <w:r>
+        <w:rPr/>
+        <w:t>sample</w:t>
+      </w:r>
+      <w:r>
+        <w:rPr/>
+        <w:t xml:space="preserve"> parameter points</w:t>
       </w:r>
       <w:r>
         <w:rPr/>
@@ -1520,10 +1566,10 @@
       </w:pPr>
       <w:r>
         <w:drawing>
-          <wp:inline wp14:editId="409BEF02" wp14:anchorId="3E7B02C6">
-            <wp:extent cx="3086100" cy="247650"/>
+          <wp:inline wp14:editId="4334C28E" wp14:anchorId="11C45872">
+            <wp:extent cx="4572000" cy="142875"/>
             <wp:effectExtent l="0" t="0" r="0" b="0"/>
-            <wp:docPr id="1978780597" name="picture" title=""/>
+            <wp:docPr id="1743593408" name="picture" title=""/>
             <wp:cNvGraphicFramePr>
               <a:graphicFrameLocks noChangeAspect="1"/>
             </wp:cNvGraphicFramePr>
@@ -1535,10 +1581,10 @@
                     <pic:cNvPicPr/>
                   </pic:nvPicPr>
                   <pic:blipFill>
-                    <a:blip r:embed="R5f141f960f794b86">
-                      <a:extLst xmlns:a="http://schemas.openxmlformats.org/drawingml/2006/main">
+                    <a:blip r:embed="R2aa29c88f1c04bc5">
+                      <a:extLst>
                         <a:ext xmlns:a="http://schemas.openxmlformats.org/drawingml/2006/main" uri="{28A0092B-C50C-407E-A947-70E740481C1C}">
-                          <a14:useLocalDpi xmlns:a14="http://schemas.microsoft.com/office/drawing/2010/main" val="0"/>
+                          <a14:useLocalDpi val="0"/>
                         </a:ext>
                       </a:extLst>
                     </a:blip>
@@ -1549,7 +1595,7 @@
                   <pic:spPr>
                     <a:xfrm>
                       <a:off x="0" y="0"/>
-                      <a:ext cx="3086100" cy="247650"/>
+                      <a:ext cx="4572000" cy="142875"/>
                     </a:xfrm>
                     <a:prstGeom prst="rect">
                       <a:avLst/>
@@ -2710,7 +2756,7 @@
         </w:drawing>
       </w:r>
     </w:p>
-    <w:p>
+    <w:p w14:noSpellErr="1">
       <w:pPr>
         <w:pStyle w:val="ListParagraph"/>
         <w:numPr>
@@ -2718,10 +2764,8 @@
           <w:numId w:val="7"/>
         </w:numPr>
         <w:rPr>
-          <w:noProof w:val="0"/>
-          <w:sz w:val="22"/>
-          <w:szCs w:val="22"/>
-          <w:lang w:val="en-US"/>
+          <w:sz w:val="22"/>
+          <w:szCs w:val="22"/>
         </w:rPr>
       </w:pPr>
       <w:r>
@@ -2743,215 +2787,25 @@
           <w:noProof w:val="0"/>
           <w:lang w:val="en-US"/>
         </w:rPr>
-        <w:t xml:space="preserve">o keep all existing cuts and </w:t>
-      </w:r>
-      <w:r>
-        <w:rPr>
-          <w:noProof w:val="0"/>
-          <w:lang w:val="en-US"/>
-        </w:rPr>
-        <w:t xml:space="preserve">with to apply them to the current </w:t>
-      </w:r>
-      <w:r>
-        <w:rPr>
-          <w:noProof w:val="0"/>
-          <w:lang w:val="en-US"/>
-        </w:rPr>
-        <w:t xml:space="preserve">iteration </w:t>
-      </w:r>
-      <w:r>
-        <w:rPr>
-          <w:noProof w:val="0"/>
-          <w:lang w:val="en-US"/>
-        </w:rPr>
-        <w:t xml:space="preserve">to </w:t>
-      </w:r>
-      <w:r>
-        <w:rPr>
-          <w:noProof w:val="0"/>
-          <w:lang w:val="en-US"/>
-        </w:rPr>
-        <w:t>generate candidate parameter space points for the next (potential) iteration</w:t>
-      </w:r>
-      <w:r>
-        <w:rPr>
-          <w:noProof w:val="0"/>
-          <w:lang w:val="en-US"/>
-        </w:rPr>
-        <w:t>, you will need to run '</w:t>
-      </w:r>
-      <w:r>
-        <w:rPr>
-          <w:noProof w:val="0"/>
-          <w:lang w:val="en-US"/>
-        </w:rPr>
-        <w:t>hm</w:t>
-      </w:r>
-      <w:r>
-        <w:rPr>
-          <w:noProof w:val="0"/>
-          <w:lang w:val="en-US"/>
-        </w:rPr>
-        <w:t xml:space="preserve"> cut'</w:t>
-      </w:r>
-      <w:r>
-        <w:rPr>
-          <w:noProof w:val="0"/>
-          <w:lang w:val="en-US"/>
-        </w:rPr>
-        <w:t xml:space="preserve">. The following example will </w:t>
-      </w:r>
-      <w:r>
-        <w:rPr>
-          <w:noProof w:val="0"/>
-          <w:lang w:val="en-US"/>
-        </w:rPr>
-        <w:t>utilize ALL cut directories in CASE/</w:t>
-      </w:r>
-      <w:proofErr w:type="spellStart"/>
-      <w:r>
-        <w:rPr>
-          <w:noProof w:val="0"/>
-          <w:lang w:val="en-US"/>
-        </w:rPr>
-        <w:t>iterN</w:t>
-      </w:r>
-      <w:proofErr w:type="spellEnd"/>
-      <w:r>
-        <w:rPr>
-          <w:noProof w:val="0"/>
-          <w:lang w:val="en-US"/>
-        </w:rPr>
-        <w:t xml:space="preserve">/Cuts/ to </w:t>
-      </w:r>
-      <w:r>
-        <w:rPr>
-          <w:noProof w:val="0"/>
-          <w:lang w:val="en-US"/>
-        </w:rPr>
-        <w:t>create at least 1000 new sample parameter space points</w:t>
-      </w:r>
-      <w:r>
-        <w:rPr>
-          <w:noProof w:val="0"/>
-          <w:lang w:val="en-US"/>
-        </w:rPr>
-        <w:t xml:space="preserve"> for use in iteration 3 (in file </w:t>
-      </w:r>
-      <w:proofErr w:type="gramStart"/>
-      <w:r>
-        <w:rPr>
-          <w:noProof w:val="0"/>
-          <w:lang w:val="en-US"/>
-        </w:rPr>
-        <w:t>CASE/iter2/</w:t>
-      </w:r>
-      <w:r>
-        <w:rPr>
-          <w:rFonts w:ascii="Calibri" w:hAnsi="Calibri" w:eastAsia="Calibri" w:cs="Calibri"/>
-          <w:noProof w:val="0"/>
-          <w:sz w:val="22"/>
-          <w:szCs w:val="22"/>
-          <w:lang w:val="en-US"/>
-        </w:rPr>
-        <w:t>Candidates_for_iteration.</w:t>
-      </w:r>
-      <w:r>
-        <w:rPr>
-          <w:rFonts w:ascii="Calibri" w:hAnsi="Calibri" w:eastAsia="Calibri" w:cs="Calibri"/>
-          <w:noProof w:val="0"/>
-          <w:sz w:val="22"/>
-          <w:szCs w:val="22"/>
-          <w:lang w:val="en-US"/>
-        </w:rPr>
-        <w:t>xlsx</w:t>
-      </w:r>
-      <w:r>
-        <w:rPr>
-          <w:rFonts w:ascii="Calibri" w:hAnsi="Calibri" w:eastAsia="Calibri" w:cs="Calibri"/>
-          <w:noProof w:val="0"/>
-          <w:sz w:val="22"/>
-          <w:szCs w:val="22"/>
-          <w:lang w:val="en-US"/>
-        </w:rPr>
-        <w:t xml:space="preserve"> )</w:t>
-      </w:r>
-      <w:proofErr w:type="gramEnd"/>
-    </w:p>
-    <w:p w14:noSpellErr="1">
-      <w:pPr>
-        <w:pStyle w:val="Normal"/>
-      </w:pPr>
-      <w:r>
-        <w:drawing>
-          <wp:inline wp14:editId="0737814A" wp14:anchorId="50CF32DD">
-            <wp:extent cx="2000250" cy="200025"/>
-            <wp:effectExtent l="0" t="0" r="0" b="0"/>
-            <wp:docPr id="1871662845" name="picture" title=""/>
-            <wp:cNvGraphicFramePr>
-              <a:graphicFrameLocks noChangeAspect="1"/>
-            </wp:cNvGraphicFramePr>
-            <a:graphic>
-              <a:graphicData uri="http://schemas.openxmlformats.org/drawingml/2006/picture">
-                <pic:pic>
-                  <pic:nvPicPr>
-                    <pic:cNvPr id="0" name="picture"/>
-                    <pic:cNvPicPr/>
-                  </pic:nvPicPr>
-                  <pic:blipFill>
-                    <a:blip r:embed="R0d8d9e35d066414e">
-                      <a:extLst xmlns:a="http://schemas.openxmlformats.org/drawingml/2006/main">
-                        <a:ext xmlns:a="http://schemas.openxmlformats.org/drawingml/2006/main" uri="{28A0092B-C50C-407E-A947-70E740481C1C}">
-                          <a14:useLocalDpi xmlns:a14="http://schemas.microsoft.com/office/drawing/2010/main" val="0"/>
-                        </a:ext>
-                      </a:extLst>
-                    </a:blip>
-                    <a:stretch>
-                      <a:fillRect/>
-                    </a:stretch>
-                  </pic:blipFill>
-                  <pic:spPr xmlns:pic="http://schemas.openxmlformats.org/drawingml/2006/picture">
-                    <a:xfrm xmlns:a="http://schemas.openxmlformats.org/drawingml/2006/main">
-                      <a:off x="0" y="0"/>
-                      <a:ext cx="2000250" cy="200025"/>
-                    </a:xfrm>
-                    <a:prstGeom xmlns:a="http://schemas.openxmlformats.org/drawingml/2006/main" prst="rect">
-                      <a:avLst/>
-                    </a:prstGeom>
-                  </pic:spPr>
-                </pic:pic>
-              </a:graphicData>
-            </a:graphic>
-          </wp:inline>
-        </w:drawing>
-      </w:r>
-    </w:p>
-    <w:p>
-      <w:pPr>
-        <w:pStyle w:val="Normal"/>
+        <w:t>o keep all existing cuts</w:t>
+      </w:r>
+      <w:r>
+        <w:rPr>
+          <w:noProof w:val="0"/>
+          <w:lang w:val="en-US"/>
+        </w:rPr>
+        <w:t>, go to step 1, iteration number one greater.</w:t>
+      </w:r>
+    </w:p>
+    <w:p w14:noSpellErr="1">
+      <w:pPr>
+        <w:pStyle w:val="ListParagraph"/>
         <w:ind w:left="360"/>
         <w:rPr>
           <w:noProof w:val="0"/>
           <w:lang w:val="en-US"/>
         </w:rPr>
       </w:pPr>
-    </w:p>
-    <w:p w14:noSpellErr="1">
-      <w:pPr>
-        <w:pStyle w:val="ListParagraph"/>
-        <w:numPr>
-          <w:ilvl w:val="0"/>
-          <w:numId w:val="7"/>
-        </w:numPr>
-        <w:rPr>
-          <w:sz w:val="22"/>
-          <w:szCs w:val="22"/>
-        </w:rPr>
-      </w:pPr>
-      <w:r>
-        <w:rPr/>
-        <w:t>Go to step 1, iteration number one greater.</w:t>
-      </w:r>
     </w:p>
     <w:sectPr>
       <w:pgSz w:w="12240" w:h="15840" w:orient="portrait"/>

</xml_diff>